<commit_message>
Update repository status and release notes
Record the public repository commit and the corpus redistribution
boundary in the response letter, cover letter, and consistency report.
</commit_message>
<xml_diff>
--- a/docs/paper/cover_letter.docx
+++ b/docs/paper/cover_letter.docx
@@ -540,7 +540,19 @@
         </w:numPr>
       </w:pPr>
       <w:r>
-        <w:t xml:space="preserve">Code, blinded sheets, audit artifacts, and per-query scores will be available at https://github.com/sepnlab/NutriAgent; the sanitized release is prepared and will be public before resubmission. A Zenodo DOI is optional and will be added only if an archive is created.</w:t>
+        <w:t xml:space="preserve">Code, blinded sheets, audit artifacts, and per-query scores are available at https://github.com/sepnlab/NutriAgent (commit</w:t>
+      </w:r>
+      <w:r>
+        <w:t xml:space="preserve"> </w:t>
+      </w:r>
+      <w:r>
+        <w:rPr>
+          <w:rStyle w:val="VerbatimChar"/>
+        </w:rPr>
+        <w:t xml:space="preserve">1d5795dc</w:t>
+      </w:r>
+      <w:r>
+        <w:t xml:space="preserve">). The layer-hen corpus is not redistributed because some source terms do not clearly permit it; provenance and extraction are documented in Table S3. A Zenodo DOI is optional and will be added only if an archive is created.</w:t>
       </w:r>
     </w:p>
     <w:p>

</xml_diff>